<commit_message>
Mentor round: integration hub, AI early warning, tap monitoring, live map issues
Responds to the mentor's feedback (all on simulated data, clearly labelled):
- Mock integration hub: IMIS, Sujal Gaon / Sujalam Bharat, JJM Dashboard and
  WQMIS connectors, ID crosswalk, automatic pushes and a message log
- AI engine: Isolation Forest anomaly detection, robust trend forecasts,
  chlorine-decay water-quality outlook, repeat-failure outlook
- Live functional-household-tap-connection monitor
- New screens: AI Early Warning, Tap Connections, Integrations
- Issues layer on the 3D and schematic maps
- Visual redesign of the landing page, GP dashboard and officer overview
- Simulator "degrading" scenario; handover spec and README updated
- 143 backend tests
</commit_message>
<xml_diff>
--- a/docs/JalRakshak_Handover_Spec.docx
+++ b/docs/JalRakshak_Handover_Spec.docx
@@ -196,7 +196,7 @@
                 <w:b w:val="0"/>
                 <w:sz w:val="19"/>
               </w:rPr>
-              <w:t>Working prototype, Stages 1 to 10 of 11 complete (17 October 2026)</w:t>
+              <w:t>Working prototype: Stages 1 to 10, plus the mentor round (integration hub, AI early warning, tap monitoring). 18 October 2026</w:t>
             </w:r>
           </w:p>
         </w:tc>
@@ -1241,6 +1241,289 @@
     </w:p>
     <w:p>
       <w:pPr>
+        <w:pStyle w:val="Heading2"/>
+      </w:pPr>
+      <w:r>
+        <w:t>2.5 Mentor feedback and how we responded</w:t>
+      </w:r>
+    </w:p>
+    <w:p>
+      <w:pPr>
+        <w:spacing w:after="120"/>
+      </w:pPr>
+      <w:r>
+        <w:rPr>
+          <w:i w:val="0"/>
+        </w:rPr>
+        <w:t>Our mentor reviewed the prototype and said three things from the problem statement were not covered or emphasised, the map should show issues from the values captured, the UI was too text-heavy, and "mock everything" for now. This is how each point was handled (all on simulated data):</w:t>
+      </w:r>
+    </w:p>
+    <w:tbl>
+      <w:tblPr>
+        <w:tblStyle w:val="TableGrid"/>
+        <w:tblW w:type="auto" w:w="0"/>
+        <w:jc w:val="center"/>
+        <w:tblLook w:firstColumn="1" w:firstRow="1" w:lastColumn="0" w:lastRow="0" w:noHBand="0" w:noVBand="1" w:val="04A0"/>
+      </w:tblPr>
+      <w:tblGrid>
+        <w:gridCol w:w="4706"/>
+        <w:gridCol w:w="4706"/>
+      </w:tblGrid>
+      <w:tr>
+        <w:tc>
+          <w:tcPr>
+            <w:tcW w:type="dxa" w:w="3969"/>
+            <w:shd w:val="clear" w:color="auto" w:fill="0F766E"/>
+          </w:tcPr>
+          <w:p>
+            <w:r/>
+            <w:r>
+              <w:rPr>
+                <w:b/>
+                <w:color w:val="FFFFFF"/>
+                <w:sz w:val="19"/>
+              </w:rPr>
+              <w:t>Mentor feedback</w:t>
+            </w:r>
+          </w:p>
+        </w:tc>
+        <w:tc>
+          <w:tcPr>
+            <w:tcW w:type="dxa" w:w="5102"/>
+            <w:shd w:val="clear" w:color="auto" w:fill="0F766E"/>
+          </w:tcPr>
+          <w:p>
+            <w:r/>
+            <w:r>
+              <w:rPr>
+                <w:b/>
+                <w:color w:val="FFFFFF"/>
+                <w:sz w:val="19"/>
+              </w:rPr>
+              <w:t>Response</w:t>
+            </w:r>
+          </w:p>
+        </w:tc>
+      </w:tr>
+      <w:tr>
+        <w:tc>
+          <w:tcPr>
+            <w:tcW w:type="dxa" w:w="3969"/>
+          </w:tcPr>
+          <w:p>
+            <w:r/>
+            <w:r>
+              <w:rPr>
+                <w:sz w:val="19"/>
+              </w:rPr>
+              <w:t>Automatic integration with IMIS, Sujal Gaon IDs and other JJM platforms was not emphasised.</w:t>
+            </w:r>
+          </w:p>
+        </w:tc>
+        <w:tc>
+          <w:tcPr>
+            <w:tcW w:type="dxa" w:w="5102"/>
+          </w:tcPr>
+          <w:p>
+            <w:r/>
+            <w:r>
+              <w:rPr>
+                <w:sz w:val="19"/>
+              </w:rPr>
+              <w:t>An integration hub with four mock connectors, an ID crosswalk and a message log; incident changes and monitoring data are pushed automatically.</w:t>
+            </w:r>
+          </w:p>
+        </w:tc>
+      </w:tr>
+      <w:tr>
+        <w:tc>
+          <w:tcPr>
+            <w:tcW w:type="dxa" w:w="3969"/>
+          </w:tcPr>
+          <w:p>
+            <w:r/>
+            <w:r>
+              <w:rPr>
+                <w:sz w:val="19"/>
+              </w:rPr>
+              <w:t>AI/ML platform for real-time monitoring of Functional Household Tap Connections and service delivery.</w:t>
+            </w:r>
+          </w:p>
+        </w:tc>
+        <w:tc>
+          <w:tcPr>
+            <w:tcW w:type="dxa" w:w="5102"/>
+          </w:tcPr>
+          <w:p>
+            <w:r/>
+            <w:r>
+              <w:rPr>
+                <w:sz w:val="19"/>
+              </w:rPr>
+              <w:t>An AI engine (Isolation Forest anomaly detection, forecasts) and a live tap-connection monitor.</w:t>
+            </w:r>
+          </w:p>
+        </w:tc>
+      </w:tr>
+      <w:tr>
+        <w:tc>
+          <w:tcPr>
+            <w:tcW w:type="dxa" w:w="3969"/>
+          </w:tcPr>
+          <w:p>
+            <w:r/>
+            <w:r>
+              <w:rPr>
+                <w:sz w:val="19"/>
+              </w:rPr>
+              <w:t>Early identification and prediction of service disruptions, water quality issues and infrastructure failures.</w:t>
+            </w:r>
+          </w:p>
+        </w:tc>
+        <w:tc>
+          <w:tcPr>
+            <w:tcW w:type="dxa" w:w="5102"/>
+          </w:tcPr>
+          <w:p>
+            <w:r/>
+            <w:r>
+              <w:rPr>
+                <w:sz w:val="19"/>
+              </w:rPr>
+              <w:t>AI Early Warning: pressure forecast, chlorine-based water-quality outlook, and a repeat-failure outlook.</w:t>
+            </w:r>
+          </w:p>
+        </w:tc>
+      </w:tr>
+      <w:tr>
+        <w:tc>
+          <w:tcPr>
+            <w:tcW w:type="dxa" w:w="3969"/>
+          </w:tcPr>
+          <w:p>
+            <w:r/>
+            <w:r>
+              <w:rPr>
+                <w:sz w:val="19"/>
+              </w:rPr>
+              <w:t>Show issues on the map from the values captured.</w:t>
+            </w:r>
+          </w:p>
+        </w:tc>
+        <w:tc>
+          <w:tcPr>
+            <w:tcW w:type="dxa" w:w="5102"/>
+          </w:tcPr>
+          <w:p>
+            <w:r/>
+            <w:r>
+              <w:rPr>
+                <w:sz w:val="19"/>
+              </w:rPr>
+              <w:t>A live Issues layer on the 3D and schematic maps, driven by alerts, AI warnings, quality risk and tap functionality.</w:t>
+            </w:r>
+          </w:p>
+        </w:tc>
+      </w:tr>
+      <w:tr>
+        <w:tc>
+          <w:tcPr>
+            <w:tcW w:type="dxa" w:w="3969"/>
+          </w:tcPr>
+          <w:p>
+            <w:r/>
+            <w:r>
+              <w:rPr>
+                <w:sz w:val="19"/>
+              </w:rPr>
+              <w:t>UI is not good, mainly text.</w:t>
+            </w:r>
+          </w:p>
+        </w:tc>
+        <w:tc>
+          <w:tcPr>
+            <w:tcW w:type="dxa" w:w="5102"/>
+          </w:tcPr>
+          <w:p>
+            <w:r/>
+            <w:r>
+              <w:rPr>
+                <w:sz w:val="19"/>
+              </w:rPr>
+              <w:t>Landing page, GP dashboard and officer overview redesigned around charts, gauges and status tiles.</w:t>
+            </w:r>
+          </w:p>
+        </w:tc>
+      </w:tr>
+      <w:tr>
+        <w:tc>
+          <w:tcPr>
+            <w:tcW w:type="dxa" w:w="3969"/>
+          </w:tcPr>
+          <w:p>
+            <w:r/>
+            <w:r>
+              <w:rPr>
+                <w:sz w:val="19"/>
+              </w:rPr>
+              <w:t>Mock everything.</w:t>
+            </w:r>
+          </w:p>
+        </w:tc>
+        <w:tc>
+          <w:tcPr>
+            <w:tcW w:type="dxa" w:w="5102"/>
+          </w:tcPr>
+          <w:p>
+            <w:r/>
+            <w:r>
+              <w:rPr>
+                <w:sz w:val="19"/>
+              </w:rPr>
+              <w:t>Done, and clearly labelled. We still never claim a real integration, a field result or a model accuracy.</w:t>
+            </w:r>
+          </w:p>
+        </w:tc>
+      </w:tr>
+    </w:tbl>
+    <w:p>
+      <w:pPr>
+        <w:spacing w:after="40"/>
+      </w:pPr>
+    </w:p>
+    <w:tbl>
+      <w:tblPr>
+        <w:tblW w:type="auto" w:w="0"/>
+        <w:tblLook w:firstColumn="1" w:firstRow="1" w:lastColumn="0" w:lastRow="0" w:noHBand="0" w:noVBand="1" w:val="04A0"/>
+      </w:tblPr>
+      <w:tblGrid>
+        <w:gridCol w:w="9412"/>
+      </w:tblGrid>
+      <w:tr>
+        <w:tc>
+          <w:tcPr>
+            <w:tcW w:type="dxa" w:w="9412"/>
+            <w:shd w:val="clear" w:color="auto" w:fill="FEF3C7"/>
+          </w:tcPr>
+          <w:p>
+            <w:r/>
+            <w:r>
+              <w:rPr>
+                <w:sz w:val="19"/>
+              </w:rPr>
+              <w:t>Mock does not mean pretend. The connectors are simulated and labelled as such on every screen. Saying or showing otherwise to judges would be a misrepresentation, and the labels are what make the demo credible.</w:t>
+            </w:r>
+          </w:p>
+        </w:tc>
+      </w:tr>
+    </w:tbl>
+    <w:p>
+      <w:pPr>
+        <w:spacing w:after="40"/>
+      </w:pPr>
+    </w:p>
+    <w:p>
+      <w:pPr>
         <w:pStyle w:val="Heading1"/>
       </w:pPr>
       <w:r>
@@ -1941,6 +2224,94 @@
               <w:rPr>
                 <w:sz w:val="19"/>
               </w:rPr>
+              <w:t>Siri</w:t>
+            </w:r>
+          </w:p>
+        </w:tc>
+        <w:tc>
+          <w:tcPr>
+            <w:tcW w:type="dxa" w:w="6917"/>
+          </w:tcPr>
+          <w:p>
+            <w:r/>
+            <w:r>
+              <w:rPr>
+                <w:sz w:val="19"/>
+              </w:rPr>
+              <w:t>UI redesign by Siri (merged as pull request #1): glass theme and dark mode, 3D terrain map with analysis layers, water-quality field tests, source outlook, Water Service Score, missed-call and WhatsApp reporting, several complaints per villager</w:t>
+            </w:r>
+          </w:p>
+        </w:tc>
+        <w:tc>
+          <w:tcPr>
+            <w:tcW w:type="dxa" w:w="1361"/>
+          </w:tcPr>
+          <w:p>
+            <w:r/>
+            <w:r>
+              <w:rPr>
+                <w:sz w:val="19"/>
+              </w:rPr>
+              <w:t>Done</w:t>
+            </w:r>
+          </w:p>
+        </w:tc>
+      </w:tr>
+      <w:tr>
+        <w:tc>
+          <w:tcPr>
+            <w:tcW w:type="dxa" w:w="794"/>
+          </w:tcPr>
+          <w:p>
+            <w:r/>
+            <w:r>
+              <w:rPr>
+                <w:sz w:val="19"/>
+              </w:rPr>
+              <w:t>Mentor round</w:t>
+            </w:r>
+          </w:p>
+        </w:tc>
+        <w:tc>
+          <w:tcPr>
+            <w:tcW w:type="dxa" w:w="6917"/>
+          </w:tcPr>
+          <w:p>
+            <w:r/>
+            <w:r>
+              <w:rPr>
+                <w:sz w:val="19"/>
+              </w:rPr>
+              <w:t>Integration hub (mock IMIS, Sujal Gaon / Sujalam Bharat, JJM Dashboard, WQMIS), AI engine, tap-connection monitor, AI Early Warning, live Issues map layer, visual UI</w:t>
+            </w:r>
+          </w:p>
+        </w:tc>
+        <w:tc>
+          <w:tcPr>
+            <w:tcW w:type="dxa" w:w="1361"/>
+          </w:tcPr>
+          <w:p>
+            <w:r/>
+            <w:r>
+              <w:rPr>
+                <w:sz w:val="19"/>
+              </w:rPr>
+              <w:t>Done</w:t>
+            </w:r>
+          </w:p>
+        </w:tc>
+      </w:tr>
+      <w:tr>
+        <w:tc>
+          <w:tcPr>
+            <w:tcW w:type="dxa" w:w="794"/>
+          </w:tcPr>
+          <w:p>
+            <w:r/>
+            <w:r>
+              <w:rPr>
+                <w:sz w:val="19"/>
+              </w:rPr>
               <w:t>11</w:t>
             </w:r>
           </w:p>
@@ -2493,6 +2864,138 @@
           </w:p>
         </w:tc>
       </w:tr>
+      <w:tr>
+        <w:tc>
+          <w:tcPr>
+            <w:tcW w:type="dxa" w:w="3118"/>
+          </w:tcPr>
+          <w:p>
+            <w:r/>
+            <w:r>
+              <w:rPr>
+                <w:sz w:val="19"/>
+              </w:rPr>
+              <w:t>IMIS / Sujal Gaon / JJM Dashboard / WQMIS connectors</w:t>
+            </w:r>
+          </w:p>
+        </w:tc>
+        <w:tc>
+          <w:tcPr>
+            <w:tcW w:type="dxa" w:w="3118"/>
+          </w:tcPr>
+          <w:p>
+            <w:r/>
+            <w:r>
+              <w:rPr>
+                <w:sz w:val="19"/>
+              </w:rPr>
+              <w:t>Mock only (message building and logging are real code)</w:t>
+            </w:r>
+          </w:p>
+        </w:tc>
+        <w:tc>
+          <w:tcPr>
+            <w:tcW w:type="dxa" w:w="2835"/>
+          </w:tcPr>
+          <w:p>
+            <w:r/>
+            <w:r>
+              <w:rPr>
+                <w:sz w:val="19"/>
+              </w:rPr>
+              <w:t>Illustrative message format, demo IDs</w:t>
+            </w:r>
+          </w:p>
+        </w:tc>
+      </w:tr>
+      <w:tr>
+        <w:tc>
+          <w:tcPr>
+            <w:tcW w:type="dxa" w:w="3118"/>
+          </w:tcPr>
+          <w:p>
+            <w:r/>
+            <w:r>
+              <w:rPr>
+                <w:sz w:val="19"/>
+              </w:rPr>
+              <w:t>Anomaly detection, forecasts, chlorine outlook</w:t>
+            </w:r>
+          </w:p>
+        </w:tc>
+        <w:tc>
+          <w:tcPr>
+            <w:tcW w:type="dxa" w:w="3118"/>
+          </w:tcPr>
+          <w:p>
+            <w:r/>
+            <w:r>
+              <w:rPr>
+                <w:sz w:val="19"/>
+              </w:rPr>
+              <w:t>Yes (scikit-learn, robust trend, decay model)</w:t>
+            </w:r>
+          </w:p>
+        </w:tc>
+        <w:tc>
+          <w:tcPr>
+            <w:tcW w:type="dxa" w:w="2835"/>
+          </w:tcPr>
+          <w:p>
+            <w:r/>
+            <w:r>
+              <w:rPr>
+                <w:sz w:val="19"/>
+              </w:rPr>
+              <w:t>Trained or fitted on simulated data; assumptions shown</w:t>
+            </w:r>
+          </w:p>
+        </w:tc>
+      </w:tr>
+      <w:tr>
+        <w:tc>
+          <w:tcPr>
+            <w:tcW w:type="dxa" w:w="3118"/>
+          </w:tcPr>
+          <w:p>
+            <w:r/>
+            <w:r>
+              <w:rPr>
+                <w:sz w:val="19"/>
+              </w:rPr>
+              <w:t>Tap-connection functionality</w:t>
+            </w:r>
+          </w:p>
+        </w:tc>
+        <w:tc>
+          <w:tcPr>
+            <w:tcW w:type="dxa" w:w="3118"/>
+          </w:tcPr>
+          <w:p>
+            <w:r/>
+            <w:r>
+              <w:rPr>
+                <w:sz w:val="19"/>
+              </w:rPr>
+              <w:t>Yes (estimate from live pressure and flow)</w:t>
+            </w:r>
+          </w:p>
+        </w:tc>
+        <w:tc>
+          <w:tcPr>
+            <w:tcW w:type="dxa" w:w="2835"/>
+          </w:tcPr>
+          <w:p>
+            <w:r/>
+            <w:r>
+              <w:rPr>
+                <w:sz w:val="19"/>
+              </w:rPr>
+              <w:t>Households from the mock zone register</w:t>
+            </w:r>
+          </w:p>
+        </w:tc>
+      </w:tr>
     </w:tbl>
     <w:p>
       <w:pPr>
@@ -2507,7 +3010,7 @@
         <w:rPr>
           <w:i w:val="0"/>
         </w:rPr>
-        <w:t>Test status at handover: 113 backend tests pass, the seed validator passes, and the frontend production build succeeds.</w:t>
+        <w:t>Test status at handover: 143 backend tests pass, the seed validator passes, and the frontend production build succeeds.</w:t>
       </w:r>
     </w:p>
     <w:p>
@@ -3560,6 +4063,443 @@
           <w:i w:val="0"/>
         </w:rPr>
         <w:t>In-app only: "being checked", "repair started", "restored (verified)" or "resolved (not sensor-verified)", in English, Telugu and Hindi, under Updates on the villager's home screen. No SMS or voice calls, and no phone numbers are stored.</w:t>
+      </w:r>
+    </w:p>
+    <w:p>
+      <w:pPr>
+        <w:pStyle w:val="Heading2"/>
+      </w:pPr>
+      <w:r>
+        <w:t>6.10 Integration hub (backend/app/integrations.py)</w:t>
+      </w:r>
+    </w:p>
+    <w:p>
+      <w:pPr>
+        <w:spacing w:after="120"/>
+      </w:pPr>
+      <w:r>
+        <w:rPr>
+          <w:i w:val="0"/>
+        </w:rPr>
+        <w:t>Four mock connectors show how JalRakshak would plug into the national platforms. Messages are built in an illustrative format (the official schemas are not available to us), "accepted" by a mock endpoint and written to the integration_events table. Nothing leaves the server.</w:t>
+      </w:r>
+    </w:p>
+    <w:tbl>
+      <w:tblPr>
+        <w:tblStyle w:val="TableGrid"/>
+        <w:tblW w:type="auto" w:w="0"/>
+        <w:jc w:val="center"/>
+        <w:tblLook w:firstColumn="1" w:firstRow="1" w:lastColumn="0" w:lastRow="0" w:noHBand="0" w:noVBand="1" w:val="04A0"/>
+      </w:tblPr>
+      <w:tblGrid>
+        <w:gridCol w:w="3137"/>
+        <w:gridCol w:w="3137"/>
+        <w:gridCol w:w="3137"/>
+      </w:tblGrid>
+      <w:tr>
+        <w:tc>
+          <w:tcPr>
+            <w:tcW w:type="dxa" w:w="2381"/>
+            <w:shd w:val="clear" w:color="auto" w:fill="0F766E"/>
+          </w:tcPr>
+          <w:p>
+            <w:r/>
+            <w:r>
+              <w:rPr>
+                <w:b/>
+                <w:color w:val="FFFFFF"/>
+                <w:sz w:val="19"/>
+              </w:rPr>
+              <w:t>Connector</w:t>
+            </w:r>
+          </w:p>
+        </w:tc>
+        <w:tc>
+          <w:tcPr>
+            <w:tcW w:type="dxa" w:w="1134"/>
+            <w:shd w:val="clear" w:color="auto" w:fill="0F766E"/>
+          </w:tcPr>
+          <w:p>
+            <w:r/>
+            <w:r>
+              <w:rPr>
+                <w:b/>
+                <w:color w:val="FFFFFF"/>
+                <w:sz w:val="19"/>
+              </w:rPr>
+              <w:t>Direction</w:t>
+            </w:r>
+          </w:p>
+        </w:tc>
+        <w:tc>
+          <w:tcPr>
+            <w:tcW w:type="dxa" w:w="5556"/>
+            <w:shd w:val="clear" w:color="auto" w:fill="0F766E"/>
+          </w:tcPr>
+          <w:p>
+            <w:r/>
+            <w:r>
+              <w:rPr>
+                <w:b/>
+                <w:color w:val="FFFFFF"/>
+                <w:sz w:val="19"/>
+              </w:rPr>
+              <w:t>Carries</w:t>
+            </w:r>
+          </w:p>
+        </w:tc>
+      </w:tr>
+      <w:tr>
+        <w:tc>
+          <w:tcPr>
+            <w:tcW w:type="dxa" w:w="2381"/>
+          </w:tcPr>
+          <w:p>
+            <w:r/>
+            <w:r>
+              <w:rPr>
+                <w:sz w:val="19"/>
+              </w:rPr>
+              <w:t>Sujal Gaon / Sujalam Bharat</w:t>
+            </w:r>
+          </w:p>
+        </w:tc>
+        <w:tc>
+          <w:tcPr>
+            <w:tcW w:type="dxa" w:w="1134"/>
+          </w:tcPr>
+          <w:p>
+            <w:r/>
+            <w:r>
+              <w:rPr>
+                <w:sz w:val="19"/>
+              </w:rPr>
+              <w:t>Pull</w:t>
+            </w:r>
+          </w:p>
+        </w:tc>
+        <w:tc>
+          <w:tcPr>
+            <w:tcW w:type="dxa" w:w="5556"/>
+          </w:tcPr>
+          <w:p>
+            <w:r/>
+            <w:r>
+              <w:rPr>
+                <w:sz w:val="19"/>
+              </w:rPr>
+              <w:t>Village LGD code, Sujal Gaon ID per service area, Sujalam Bharat scheme ID, asset registry</w:t>
+            </w:r>
+          </w:p>
+        </w:tc>
+      </w:tr>
+      <w:tr>
+        <w:tc>
+          <w:tcPr>
+            <w:tcW w:type="dxa" w:w="2381"/>
+          </w:tcPr>
+          <w:p>
+            <w:r/>
+            <w:r>
+              <w:rPr>
+                <w:sz w:val="19"/>
+              </w:rPr>
+              <w:t>IMIS</w:t>
+            </w:r>
+          </w:p>
+        </w:tc>
+        <w:tc>
+          <w:tcPr>
+            <w:tcW w:type="dxa" w:w="1134"/>
+          </w:tcPr>
+          <w:p>
+            <w:r/>
+            <w:r>
+              <w:rPr>
+                <w:sz w:val="19"/>
+              </w:rPr>
+              <w:t>Push</w:t>
+            </w:r>
+          </w:p>
+        </w:tc>
+        <w:tc>
+          <w:tcPr>
+            <w:tcW w:type="dxa" w:w="5556"/>
+          </w:tcPr>
+          <w:p>
+            <w:r/>
+            <w:r>
+              <w:rPr>
+                <w:sz w:val="19"/>
+              </w:rPr>
+              <w:t>Incident status changes; a monitoring snapshot per sensor node about once a minute</w:t>
+            </w:r>
+          </w:p>
+        </w:tc>
+      </w:tr>
+      <w:tr>
+        <w:tc>
+          <w:tcPr>
+            <w:tcW w:type="dxa" w:w="2381"/>
+          </w:tcPr>
+          <w:p>
+            <w:r/>
+            <w:r>
+              <w:rPr>
+                <w:sz w:val="19"/>
+              </w:rPr>
+              <w:t>JJM Dashboard</w:t>
+            </w:r>
+          </w:p>
+        </w:tc>
+        <w:tc>
+          <w:tcPr>
+            <w:tcW w:type="dxa" w:w="1134"/>
+          </w:tcPr>
+          <w:p>
+            <w:r/>
+            <w:r>
+              <w:rPr>
+                <w:sz w:val="19"/>
+              </w:rPr>
+              <w:t>Push</w:t>
+            </w:r>
+          </w:p>
+        </w:tc>
+        <w:tc>
+          <w:tcPr>
+            <w:tcW w:type="dxa" w:w="5556"/>
+          </w:tcPr>
+          <w:p>
+            <w:r/>
+            <w:r>
+              <w:rPr>
+                <w:sz w:val="19"/>
+              </w:rPr>
+              <w:t>Functional, partial and non-functional taps per village (sent when the numbers change)</w:t>
+            </w:r>
+          </w:p>
+        </w:tc>
+      </w:tr>
+      <w:tr>
+        <w:tc>
+          <w:tcPr>
+            <w:tcW w:type="dxa" w:w="2381"/>
+          </w:tcPr>
+          <w:p>
+            <w:r/>
+            <w:r>
+              <w:rPr>
+                <w:sz w:val="19"/>
+              </w:rPr>
+              <w:t>WQMIS</w:t>
+            </w:r>
+          </w:p>
+        </w:tc>
+        <w:tc>
+          <w:tcPr>
+            <w:tcW w:type="dxa" w:w="1134"/>
+          </w:tcPr>
+          <w:p>
+            <w:r/>
+            <w:r>
+              <w:rPr>
+                <w:sz w:val="19"/>
+              </w:rPr>
+              <w:t>Push</w:t>
+            </w:r>
+          </w:p>
+        </w:tc>
+        <w:tc>
+          <w:tcPr>
+            <w:tcW w:type="dxa" w:w="5556"/>
+          </w:tcPr>
+          <w:p>
+            <w:r/>
+            <w:r>
+              <w:rPr>
+                <w:sz w:val="19"/>
+              </w:rPr>
+              <w:t>A sample request when the water-quality outlook says to test water</w:t>
+            </w:r>
+          </w:p>
+        </w:tc>
+      </w:tr>
+    </w:tbl>
+    <w:p>
+      <w:pPr>
+        <w:spacing w:after="40"/>
+      </w:pPr>
+    </w:p>
+    <w:p>
+      <w:pPr>
+        <w:pStyle w:val="ListBullet"/>
+        <w:spacing w:after="40"/>
+      </w:pPr>
+      <w:r>
+        <w:t>Incident opened, assigned, repaired, verified or resolved is pushed to IMIS automatically, once per state.</w:t>
+      </w:r>
+    </w:p>
+    <w:p>
+      <w:pPr>
+        <w:pStyle w:val="ListBullet"/>
+        <w:spacing w:after="40"/>
+      </w:pPr>
+      <w:r>
+        <w:t>Sync now sends everything at once. A failing connector never loses a sensor reading.</w:t>
+      </w:r>
+    </w:p>
+    <w:p>
+      <w:pPr>
+        <w:pStyle w:val="ListBullet"/>
+        <w:spacing w:after="40"/>
+      </w:pPr>
+      <w:r>
+        <w:t>The ID crosswalk shows our IDs next to the demo national IDs. South has no Sujal Gaon ID in the seed ("not yet issued"), and the screen says so.</w:t>
+      </w:r>
+    </w:p>
+    <w:p>
+      <w:pPr>
+        <w:pStyle w:val="ListBullet"/>
+        <w:spacing w:after="40"/>
+      </w:pPr>
+      <w:r>
+        <w:t>Messages contain no personal data. To go real: replace the _log function with a call to the real API, after authorisation and with the official specification.</w:t>
+      </w:r>
+    </w:p>
+    <w:p>
+      <w:pPr>
+        <w:pStyle w:val="Heading2"/>
+      </w:pPr>
+      <w:r>
+        <w:t>6.11 AI engine (backend/app/ml.py)</w:t>
+      </w:r>
+    </w:p>
+    <w:p>
+      <w:pPr>
+        <w:pStyle w:val="ListBullet"/>
+        <w:spacing w:after="40"/>
+      </w:pPr>
+      <w:r>
+        <w:rPr>
+          <w:b/>
+        </w:rPr>
+        <w:t xml:space="preserve">Anomaly detection: </w:t>
+      </w:r>
+      <w:r>
+        <w:t>an Isolation Forest learns normal operation from 2,000 synthetic windows and scores the last two minutes of trusted sensors. The anomaly index is 50 at the edge of normal, and the readings that are off are named.</w:t>
+      </w:r>
+    </w:p>
+    <w:p>
+      <w:pPr>
+        <w:pStyle w:val="ListBullet"/>
+        <w:spacing w:after="40"/>
+      </w:pPr>
+      <w:r>
+        <w:rPr>
+          <w:b/>
+        </w:rPr>
+        <w:t xml:space="preserve">Disruption forecast: </w:t>
+      </w:r>
+      <w:r>
+        <w:t>a robust Theil-Sen trend on tail pressure and tank level gives the minutes until the reading leaves its normal band, with a confidence label. A slow slide is caught before the alert rules fire.</w:t>
+      </w:r>
+    </w:p>
+    <w:p>
+      <w:pPr>
+        <w:pStyle w:val="ListBullet"/>
+        <w:spacing w:after="40"/>
+      </w:pPr>
+      <w:r>
+        <w:rPr>
+          <w:b/>
+        </w:rPr>
+        <w:t xml:space="preserve">Water-quality outlook: </w:t>
+      </w:r>
+      <w:r>
+        <w:t>first-order chlorine decay from water age and tail pressure (dose 0.8 mg/L and decay 0.30 per hour are assumptions). It says where to collect a field-kit sample and never certifies water as safe.</w:t>
+      </w:r>
+    </w:p>
+    <w:p>
+      <w:pPr>
+        <w:pStyle w:val="ListBullet"/>
+        <w:spacing w:after="40"/>
+      </w:pPr>
+      <w:r>
+        <w:rPr>
+          <w:b/>
+        </w:rPr>
+        <w:t xml:space="preserve">Failure outlook: </w:t>
+      </w:r>
+      <w:r>
+        <w:t>mean time between failures from each pipe's repair history plus its risk score. P-21 fails about every 330 days, and its window has passed.</w:t>
+      </w:r>
+    </w:p>
+    <w:p>
+      <w:pPr>
+        <w:spacing w:after="120"/>
+      </w:pPr>
+      <w:r>
+        <w:rPr>
+          <w:i w:val="0"/>
+        </w:rPr>
+        <w:t>No model claims an accuracy. The simulator has a degrading scenario (a slow leak) so the forecast can be shown warning before any alert.</w:t>
+      </w:r>
+    </w:p>
+    <w:p>
+      <w:pPr>
+        <w:pStyle w:val="Heading2"/>
+      </w:pPr>
+      <w:r>
+        <w:t>6.12 Tap-connection monitor (backend/app/fhtc.py)</w:t>
+      </w:r>
+    </w:p>
+    <w:p>
+      <w:pPr>
+        <w:spacing w:after="120"/>
+      </w:pPr>
+      <w:r>
+        <w:rPr>
+          <w:i w:val="0"/>
+        </w:rPr>
+        <w:t>Estimates, for every household in each zone's register, the water reaching the tap from live head and tail pressure and tail flow: functional (55 L/person/day or more), partly working (30 to 54) or not working. Without live data it uses recorded baselines and says so. A deployment would use household tap sensors or sample meters.</w:t>
+      </w:r>
+    </w:p>
+    <w:p>
+      <w:pPr>
+        <w:pStyle w:val="Heading2"/>
+      </w:pPr>
+      <w:r>
+        <w:t>6.13 Map issues and the redesigned screens</w:t>
+      </w:r>
+    </w:p>
+    <w:p>
+      <w:pPr>
+        <w:pStyle w:val="ListBullet"/>
+        <w:spacing w:after="40"/>
+      </w:pPr>
+      <w:r>
+        <w:t>The Issues layer on the village map pins every problem where it happens: sensor alerts, AI warnings, water-quality risk, equipment faults and clusters of taps short of water. It also draws on the schematic map when the 3D tiles cannot load.</w:t>
+      </w:r>
+    </w:p>
+    <w:p>
+      <w:pPr>
+        <w:pStyle w:val="ListBullet"/>
+        <w:spacing w:after="40"/>
+      </w:pPr>
+      <w:r>
+        <w:t>New screens: AI Early Warning, Tap Connections and Integrations (GP and officer). The landing page, GP dashboard and officer overview now lead with charts and status tiles.</w:t>
+      </w:r>
+    </w:p>
+    <w:p>
+      <w:pPr>
+        <w:spacing w:after="120"/>
+      </w:pPr>
+      <w:r>
+        <w:rPr>
+          <w:i w:val="0"/>
+        </w:rPr>
+        <w:t>Third-party assets to review before any public use: the landing video is loaded from an external CloudFront address, and the 3D map uses Esri satellite imagery, AWS terrain tiles and OpenFreeMap. Check their licences and terms, and replace them with assets we own or license for anything beyond the demo.</w:t>
       </w:r>
     </w:p>
     <w:p>
@@ -4371,6 +5311,66 @@
               <w:rPr>
                 <w:sz w:val="19"/>
               </w:rPr>
+              <w:t>AI and taps</w:t>
+            </w:r>
+          </w:p>
+        </w:tc>
+        <w:tc>
+          <w:tcPr>
+            <w:tcW w:type="dxa" w:w="7370"/>
+          </w:tcPr>
+          <w:p>
+            <w:r/>
+            <w:r>
+              <w:rPr>
+                <w:sz w:val="19"/>
+              </w:rPr>
+              <w:t>GET predictions · GET fhtc</w:t>
+            </w:r>
+          </w:p>
+        </w:tc>
+      </w:tr>
+      <w:tr>
+        <w:tc>
+          <w:tcPr>
+            <w:tcW w:type="dxa" w:w="1701"/>
+          </w:tcPr>
+          <w:p>
+            <w:r/>
+            <w:r>
+              <w:rPr>
+                <w:sz w:val="19"/>
+              </w:rPr>
+              <w:t>Integrations (mock)</w:t>
+            </w:r>
+          </w:p>
+        </w:tc>
+        <w:tc>
+          <w:tcPr>
+            <w:tcW w:type="dxa" w:w="7370"/>
+          </w:tcPr>
+          <w:p>
+            <w:r/>
+            <w:r>
+              <w:rPr>
+                <w:sz w:val="19"/>
+              </w:rPr>
+              <w:t>GET integrations · GET integrations/crosswalk · GET integrations/events · POST integrations/sync</w:t>
+            </w:r>
+          </w:p>
+        </w:tc>
+      </w:tr>
+      <w:tr>
+        <w:tc>
+          <w:tcPr>
+            <w:tcW w:type="dxa" w:w="1701"/>
+          </w:tcPr>
+          <w:p>
+            <w:r/>
+            <w:r>
+              <w:rPr>
+                <w:sz w:val="19"/>
+              </w:rPr>
               <w:t>Demo</w:t>
             </w:r>
           </w:p>
@@ -4627,7 +5627,7 @@
         <w:rPr>
           <w:i w:val="0"/>
         </w:rPr>
-        <w:t>The last command creates backend/jalrakshak.db with the demo data. Run it again whenever you want a clean demo or after pulling changes that alter the tables (the README says when).</w:t>
+        <w:t>The last command creates backend/jalrakshak.db with the demo data. Run it again whenever you want a clean demo or after pulling changes that alter the tables (the README says when). requirements.txt includes numpy and scikit-learn for the AI engine.</w:t>
       </w:r>
     </w:p>
     <w:p>
@@ -4884,6 +5884,18 @@
               <w:t>python simulator\sim.py --scenario node-offline</w:t>
             </w:r>
           </w:p>
+          <w:p>
+            <w:pPr>
+              <w:spacing w:after="0"/>
+            </w:pPr>
+            <w:r>
+              <w:rPr>
+                <w:rFonts w:ascii="Consolas" w:hAnsi="Consolas"/>
+                <w:sz w:val="18"/>
+              </w:rPr>
+              <w:t>python simulator\sim.py --scenario degrading --interval 5   # a slow leak: the AI forecast warns first</w:t>
+            </w:r>
+          </w:p>
         </w:tc>
       </w:tr>
     </w:tbl>
@@ -4937,7 +5949,7 @@
                 <w:rFonts w:ascii="Consolas" w:hAnsi="Consolas"/>
                 <w:sz w:val="18"/>
               </w:rPr>
-              <w:t>.\.venv\Scripts\python.exe -m pytest          # 113 tests should pass</w:t>
+              <w:t>.\.venv\Scripts\python.exe -m pytest          # 143 tests should pass</w:t>
             </w:r>
           </w:p>
           <w:p>
@@ -5867,7 +6879,16 @@
         <w:spacing w:after="40"/>
       </w:pPr>
       <w:r>
-        <w:t>Also show: Pipeline Health → P-21 (risk factors and sources), the officer view and Risk rules, and the తెలుగు / हिंदी language buttons.</w:t>
+        <w:t>Also show: AI Early Warning (run the degrading scenario first), Tap Connections, the Issues layer on the Village Map, and Integrations (press Sync now and open a message).</w:t>
+      </w:r>
+    </w:p>
+    <w:p>
+      <w:pPr>
+        <w:pStyle w:val="ListNumber"/>
+        <w:spacing w:after="40"/>
+      </w:pPr>
+      <w:r>
+        <w:t>And: Pipeline Health → P-21 (risk factors and sources), the officer view and Risk rules, and the తెలుగు / हिंदी language buttons.</w:t>
       </w:r>
     </w:p>
     <w:p>
@@ -6191,6 +7212,51 @@
         <w:spacing w:after="40"/>
       </w:pPr>
       <w:r>
+        <w:t>The national-platform connectors are mock: the message format is illustrative, and no real system is contacted.</w:t>
+      </w:r>
+    </w:p>
+    <w:p>
+      <w:pPr>
+        <w:pStyle w:val="ListBullet"/>
+        <w:spacing w:after="40"/>
+      </w:pPr>
+      <w:r>
+        <w:t>The AI models are trained or fitted on simulated data only; the chlorine dose and decay rate are assumptions; no accuracy is claimed.</w:t>
+      </w:r>
+    </w:p>
+    <w:p>
+      <w:pPr>
+        <w:pStyle w:val="ListBullet"/>
+        <w:spacing w:after="40"/>
+      </w:pPr>
+      <w:r>
+        <w:t>Tap functionality is an estimate from pipeline sensors, not a household measurement.</w:t>
+      </w:r>
+    </w:p>
+    <w:p>
+      <w:pPr>
+        <w:pStyle w:val="ListBullet"/>
+        <w:spacing w:after="40"/>
+      </w:pPr>
+      <w:r>
+        <w:t>Water-quality field tests logged on the Quality page are kept in the browser only; the villager screen wording such as "Safe to drink" needs review by a water-quality expert before any real use.</w:t>
+      </w:r>
+    </w:p>
+    <w:p>
+      <w:pPr>
+        <w:pStyle w:val="ListBullet"/>
+        <w:spacing w:after="40"/>
+      </w:pPr>
+      <w:r>
+        <w:t>The landing video and map imagery come from external services whose terms must be checked.</w:t>
+      </w:r>
+    </w:p>
+    <w:p>
+      <w:pPr>
+        <w:pStyle w:val="ListBullet"/>
+        <w:spacing w:after="40"/>
+      </w:pPr>
+      <w:r>
         <w:t>No automated frontend tests; no CI pipeline yet.</w:t>
       </w:r>
     </w:p>
@@ -6440,6 +7506,15 @@
         <w:spacing w:after="40"/>
       </w:pPr>
       <w:r>
+        <w:t>Retrain the Isolation Forest on real normal-operation data; learn per-pipe baselines; validate the forecast and chlorine models against measured values before quoting any accuracy.</w:t>
+      </w:r>
+    </w:p>
+    <w:p>
+      <w:pPr>
+        <w:pStyle w:val="ListBullet"/>
+        <w:spacing w:after="40"/>
+      </w:pPr>
+      <w:r>
         <w:t>Learn risk and fusion weights from real failure and repair records; publish them as new risk config versions.</w:t>
       </w:r>
     </w:p>
@@ -6484,7 +7559,7 @@
         <w:spacing w:after="40"/>
       </w:pPr>
       <w:r>
-        <w:t>Integration with IMIS, Sujalam Bharat or other JJM systems only through official, authorised access; until then keep the mock adapter.</w:t>
+        <w:t>Real integration with IMIS, Sujalam Bharat or other JJM systems only through official, authorised access and the official specification. The mock hub already fixes the IDs, the messages and the audit log, so the work is replacing one function per connector.</w:t>
       </w:r>
     </w:p>
     <w:p>
@@ -7577,7 +8652,7 @@
               <w:rPr>
                 <w:sz w:val="19"/>
               </w:rPr>
-              <w:t>backend/app/models.py, read_model.py, seed_loader.py</w:t>
+              <w:t>backend/app/ml.py, fhtc.py, predictions_api.py</w:t>
             </w:r>
           </w:p>
         </w:tc>
@@ -7591,7 +8666,7 @@
               <w:rPr>
                 <w:sz w:val="19"/>
               </w:rPr>
-              <w:t>Tables, API response shapes, demo data loading</w:t>
+              <w:t>AI engine, tap-connection monitor and their endpoints</w:t>
             </w:r>
           </w:p>
         </w:tc>
@@ -7607,7 +8682,7 @@
               <w:rPr>
                 <w:sz w:val="19"/>
               </w:rPr>
-              <w:t>backend/tests/</w:t>
+              <w:t>backend/app/integrations.py</w:t>
             </w:r>
           </w:p>
         </w:tc>
@@ -7621,7 +8696,7 @@
               <w:rPr>
                 <w:sz w:val="19"/>
               </w:rPr>
-              <w:t>113 pytest tests</w:t>
+              <w:t>Mock national-platform connectors, ID crosswalk, message log</w:t>
             </w:r>
           </w:p>
         </w:tc>
@@ -7637,7 +8712,7 @@
               <w:rPr>
                 <w:sz w:val="19"/>
               </w:rPr>
-              <w:t>frontend/src/pages/</w:t>
+              <w:t>backend/app/models.py, read_model.py, seed_loader.py</w:t>
             </w:r>
           </w:p>
         </w:tc>
@@ -7651,7 +8726,7 @@
               <w:rPr>
                 <w:sz w:val="19"/>
               </w:rPr>
-              <w:t>Screens: Login, citizen/, gp/, officer/</w:t>
+              <w:t>Tables, API response shapes, demo data loading</w:t>
             </w:r>
           </w:p>
         </w:tc>
@@ -7667,6 +8742,66 @@
               <w:rPr>
                 <w:sz w:val="19"/>
               </w:rPr>
+              <w:t>backend/tests/</w:t>
+            </w:r>
+          </w:p>
+        </w:tc>
+        <w:tc>
+          <w:tcPr>
+            <w:tcW w:type="dxa" w:w="5329"/>
+          </w:tcPr>
+          <w:p>
+            <w:r/>
+            <w:r>
+              <w:rPr>
+                <w:sz w:val="19"/>
+              </w:rPr>
+              <w:t>143 pytest tests</w:t>
+            </w:r>
+          </w:p>
+        </w:tc>
+      </w:tr>
+      <w:tr>
+        <w:tc>
+          <w:tcPr>
+            <w:tcW w:type="dxa" w:w="3742"/>
+          </w:tcPr>
+          <w:p>
+            <w:r/>
+            <w:r>
+              <w:rPr>
+                <w:sz w:val="19"/>
+              </w:rPr>
+              <w:t>frontend/src/pages/</w:t>
+            </w:r>
+          </w:p>
+        </w:tc>
+        <w:tc>
+          <w:tcPr>
+            <w:tcW w:type="dxa" w:w="5329"/>
+          </w:tcPr>
+          <w:p>
+            <w:r/>
+            <w:r>
+              <w:rPr>
+                <w:sz w:val="19"/>
+              </w:rPr>
+              <w:t>Screens: Login, citizen/, gp/, officer/</w:t>
+            </w:r>
+          </w:p>
+        </w:tc>
+      </w:tr>
+      <w:tr>
+        <w:tc>
+          <w:tcPr>
+            <w:tcW w:type="dxa" w:w="3742"/>
+          </w:tcPr>
+          <w:p>
+            <w:r/>
+            <w:r>
+              <w:rPr>
+                <w:sz w:val="19"/>
+              </w:rPr>
               <w:t>frontend/src/data/</w:t>
             </w:r>
           </w:p>
@@ -7681,7 +8816,37 @@
               <w:rPr>
                 <w:sz w:val="19"/>
               </w:rPr>
-              <w:t>API client, seed loading, polling, chart series</w:t>
+              <w:t>API client, seed loading, polling, chart series, AI hooks (ai.js), map issues (issues.js)</w:t>
+            </w:r>
+          </w:p>
+        </w:tc>
+      </w:tr>
+      <w:tr>
+        <w:tc>
+          <w:tcPr>
+            <w:tcW w:type="dxa" w:w="3742"/>
+          </w:tcPr>
+          <w:p>
+            <w:r/>
+            <w:r>
+              <w:rPr>
+                <w:sz w:val="19"/>
+              </w:rPr>
+              <w:t>frontend/src/components/viz.jsx</w:t>
+            </w:r>
+          </w:p>
+        </w:tc>
+        <w:tc>
+          <w:tcPr>
+            <w:tcW w:type="dxa" w:w="5329"/>
+          </w:tcPr>
+          <w:p>
+            <w:r/>
+            <w:r>
+              <w:rPr>
+                <w:sz w:val="19"/>
+              </w:rPr>
+              <w:t>Gauge, donut, forecast chart, chlorine meter</w:t>
             </w:r>
           </w:p>
         </w:tc>

</xml_diff>

<commit_message>
Cover the problem statement in the frontend and docs
Villager My tap and geo-tag spot picker, GP Alert Center, Tap Connections
with household detail, Maintenance Planner, officer Analytics and Audit,
screening wording for water quality, coverage matrix, README round notes
and the refreshed handover spec.
</commit_message>
<xml_diff>
--- a/docs/JalRakshak_Handover_Spec.docx
+++ b/docs/JalRakshak_Handover_Spec.docx
@@ -196,7 +196,7 @@
                 <w:b w:val="0"/>
                 <w:sz w:val="19"/>
               </w:rPr>
-              <w:t>Working prototype: Stages 1 to 10, plus the mentor round (integration hub, AI early warning, tap monitoring). 18 October 2026</w:t>
+              <w:t>Working prototype on simulated data: Stages 1 to 10, the mentor round, and a full problem-statement coverage round (household monitoring, villager feedback, alerts, planner, analytics). 18 October 2026</w:t>
             </w:r>
           </w:p>
         </w:tc>
@@ -538,10 +538,25 @@
         <w:rPr>
           <w:b/>
         </w:rPr>
+        <w:t xml:space="preserve">Is everything in the problem statement covered? </w:t>
+      </w:r>
+      <w:r>
+        <w:t>docs/Requirements_Coverage.md answers that requirement by requirement, with what is built, what is simulated or mock, and what is missing. Read it before promising anything to anyone.</w:t>
+      </w:r>
+    </w:p>
+    <w:p>
+      <w:pPr>
+        <w:pStyle w:val="ListBullet"/>
+        <w:spacing w:after="40"/>
+      </w:pPr>
+      <w:r>
+        <w:rPr>
+          <w:b/>
+        </w:rPr>
         <w:t xml:space="preserve">Detailed per-stage notes </w:t>
       </w:r>
       <w:r>
-        <w:t>are in README.md at the root of the repository. The original plan is docs/JalRakshak_Plan.md.</w:t>
+        <w:t>are in README.md at the root of the repository. The original plan is docs/JalRakshak_Plan.md. Deployment is in docs/DEPLOYMENT.md.</w:t>
       </w:r>
     </w:p>
     <w:p>
@@ -2312,6 +2327,50 @@
               <w:rPr>
                 <w:sz w:val="19"/>
               </w:rPr>
+              <w:t>Coverage round</w:t>
+            </w:r>
+          </w:p>
+        </w:tc>
+        <w:tc>
+          <w:tcPr>
+            <w:tcW w:type="dxa" w:w="6917"/>
+          </w:tcPr>
+          <w:p>
+            <w:r/>
+            <w:r>
+              <w:rPr>
+                <w:sz w:val="19"/>
+              </w:rPr>
+              <w:t>Review against the full problem statement and fill the gaps: household-level tap monitoring and villager service checks, field-test water quality on the server with advisories, an Alert Center for every alert kind, supply regularity and complaint clusters, a preventive Maintenance Planner, State-to-zone analytics with GIS and exports, a fifth (mock) connector, security and deployment files. See docs/Requirements_Coverage.md</w:t>
+            </w:r>
+          </w:p>
+        </w:tc>
+        <w:tc>
+          <w:tcPr>
+            <w:tcW w:type="dxa" w:w="1361"/>
+          </w:tcPr>
+          <w:p>
+            <w:r/>
+            <w:r>
+              <w:rPr>
+                <w:sz w:val="19"/>
+              </w:rPr>
+              <w:t>Done</w:t>
+            </w:r>
+          </w:p>
+        </w:tc>
+      </w:tr>
+      <w:tr>
+        <w:tc>
+          <w:tcPr>
+            <w:tcW w:type="dxa" w:w="794"/>
+          </w:tcPr>
+          <w:p>
+            <w:r/>
+            <w:r>
+              <w:rPr>
+                <w:sz w:val="19"/>
+              </w:rPr>
               <w:t>11</w:t>
             </w:r>
           </w:p>
@@ -3010,7 +3069,7 @@
         <w:rPr>
           <w:i w:val="0"/>
         </w:rPr>
-        <w:t>Test status at handover: 143 backend tests pass, the seed validator passes, and the frontend production build succeeds.</w:t>
+        <w:t>Test status at handover: 257 backend tests pass, the seed validator passes, and the frontend production build succeeds.</w:t>
       </w:r>
     </w:p>
     <w:p>
@@ -4504,6 +4563,243 @@
     </w:p>
     <w:p>
       <w:pPr>
+        <w:pStyle w:val="Heading2"/>
+      </w:pPr>
+      <w:r>
+        <w:t>6.14 Household-level monitoring and villager service validation (fhtc.py, households_api.py)</w:t>
+      </w:r>
+    </w:p>
+    <w:p>
+      <w:pPr>
+        <w:pStyle w:val="ListBullet"/>
+        <w:spacing w:after="40"/>
+      </w:pPr>
+      <w:r>
+        <w:t>Every household in a zone's register has a tap ID built on the zone's Sujal Gaon ID (zones without one are not given a fake one) and a status: working (55 L/person/day or more), partly working (30 to 54) or not working.</w:t>
+      </w:r>
+    </w:p>
+    <w:p>
+      <w:pPr>
+        <w:pStyle w:val="ListBullet"/>
+        <w:spacing w:after="40"/>
+      </w:pPr>
+      <w:r>
+        <w:t>Two sources decide it: the network model (live head and tail pressure and tail flow) and the villager's daily service check (did water come, was it enough, how did it look, a 1 to 5 rating and an optional comment). When they disagree the system says why: network fine but the home reports no water means a probable local fault at the tap or connection.</w:t>
+      </w:r>
+    </w:p>
+    <w:p>
+      <w:pPr>
+        <w:pStyle w:val="ListBullet"/>
+        <w:spacing w:after="40"/>
+      </w:pPr>
+      <w:r>
+        <w:t>Gram Panchayat screens: Tap Connections (donut, zones, validation counts, a filterable household table) and a household detail page. Villager screen: My tap with the check and a 14-day strip.</w:t>
+      </w:r>
+    </w:p>
+    <w:p>
+      <w:pPr>
+        <w:pStyle w:val="ListBullet"/>
+        <w:spacing w:after="40"/>
+      </w:pPr>
+      <w:r>
+        <w:t>Privacy: comments are visible to the Gram Panchayat but not to officers; only counts per zone go to other systems, never households or names.</w:t>
+      </w:r>
+    </w:p>
+    <w:p>
+      <w:pPr>
+        <w:pStyle w:val="ListBullet"/>
+        <w:spacing w:after="40"/>
+      </w:pPr>
+      <w:r>
+        <w:t>Limit: no household tap sensors, so household status is an estimate plus the villager's report.</w:t>
+      </w:r>
+    </w:p>
+    <w:p>
+      <w:pPr>
+        <w:pStyle w:val="Heading2"/>
+      </w:pPr>
+      <w:r>
+        <w:t>6.15 Water quality on the server (quality.py, quality_api.py)</w:t>
+      </w:r>
+    </w:p>
+    <w:p>
+      <w:pPr>
+        <w:pStyle w:val="ListBullet"/>
+        <w:spacing w:after="40"/>
+      </w:pPr>
+      <w:r>
+        <w:t>Field-test-kit results are stored and judged against IS 10500 limits on the server (they were browser-only before). The words are "passed" and "failed": a field kit is a screening tool and never certifies water as safe.</w:t>
+      </w:r>
+    </w:p>
+    <w:p>
+      <w:pPr>
+        <w:pStyle w:val="ListBullet"/>
+        <w:spacing w:after="40"/>
+      </w:pPr>
+      <w:r>
+        <w:t>A failed tap test raises a high alert, sends a boil-water advisory to the villagers of that zone once a day (English, Telugu, Hindi), and sends the result (without the tester's name) to WQMIS (mock). A later passing test clears the alert and tells villagers.</w:t>
+      </w:r>
+    </w:p>
+    <w:p>
+      <w:pPr>
+        <w:pStyle w:val="ListBullet"/>
+        <w:spacing w:after="40"/>
+      </w:pPr>
+      <w:r>
+        <w:t>Villagers see only their zone's verdict and date, never the measurements.</w:t>
+      </w:r>
+    </w:p>
+    <w:p>
+      <w:pPr>
+        <w:pStyle w:val="Heading2"/>
+      </w:pPr>
+      <w:r>
+        <w:t>6.16 Alert Center (ai_alerts.py, alerts_api.py)</w:t>
+      </w:r>
+    </w:p>
+    <w:p>
+      <w:pPr>
+        <w:pStyle w:val="ListBullet"/>
+        <w:spacing w:after="40"/>
+      </w:pPr>
+      <w:r>
+        <w:t>Five alert kinds in one feed: WATER_SERVICE (supply, pressure, leaks, intermittent supply), EQUIPMENT_HEALTH, AI_PREDICTION (anomaly, forecast, failure due), WATER_QUALITY (failed test, chlorine outlook, villagers' quality reports) and COMMUNITY (clusters of reports, households without water).</w:t>
+      </w:r>
+    </w:p>
+    <w:p>
+      <w:pPr>
+        <w:pStyle w:val="ListBullet"/>
+        <w:spacing w:after="40"/>
+      </w:pPr>
+      <w:r>
+        <w:t>Community alerts are never counted as sensor evidence in the incident fusion, so a complaint is never counted twice.</w:t>
+      </w:r>
+    </w:p>
+    <w:p>
+      <w:pPr>
+        <w:pStyle w:val="ListBullet"/>
+        <w:spacing w:after="40"/>
+      </w:pPr>
+      <w:r>
+        <w:t>Alerts can be acknowledged (who and when). A high alert nobody acknowledges for 30 minutes is shown as escalated to the officer. Every alert opening, acknowledgement and clearing is pushed to IMIS (mock).</w:t>
+      </w:r>
+    </w:p>
+    <w:p>
+      <w:pPr>
+        <w:pStyle w:val="ListBullet"/>
+        <w:spacing w:after="40"/>
+      </w:pPr>
+      <w:r>
+        <w:t>New models behind the alerts: supply regularity (steady, intermittent, off) and DBSCAN clusters of villager reports (at least 3 within 120 m, matched only to pipelines of their own village).</w:t>
+      </w:r>
+    </w:p>
+    <w:p>
+      <w:pPr>
+        <w:pStyle w:val="Heading2"/>
+      </w:pPr>
+      <w:r>
+        <w:t>6.17 Maintenance Planner (maintenance_api.py)</w:t>
+      </w:r>
+    </w:p>
+    <w:p>
+      <w:pPr>
+        <w:pStyle w:val="ListBullet"/>
+        <w:spacing w:after="40"/>
+      </w:pPr>
+      <w:r>
+        <w:t>Ranks pipelines from 0 to 100 using risk (40%), the repeat-failure window (25%), live signals (15%), recent incidents (10%) and time since the last inspection (10%), and shows the reasons by points. It is a ranking for planning, not a probability, and uses no costs or prices.</w:t>
+      </w:r>
+    </w:p>
+    <w:p>
+      <w:pPr>
+        <w:pStyle w:val="ListBullet"/>
+        <w:spacing w:after="40"/>
+      </w:pPr>
+      <w:r>
+        <w:t>"Plan inspection" opens a PREVENTIVE incident from the reasons and its task in one step. The task follows the normal path, and can end with "no fault found", which closes the incident without adding a repair to the pipe's history or a restoration check.</w:t>
+      </w:r>
+    </w:p>
+    <w:p>
+      <w:pPr>
+        <w:pStyle w:val="ListBullet"/>
+        <w:spacing w:after="40"/>
+      </w:pPr>
+      <w:r>
+        <w:t>Tasks now show whether they are overdue, and whether they are preventive.</w:t>
+      </w:r>
+    </w:p>
+    <w:p>
+      <w:pPr>
+        <w:pStyle w:val="Heading2"/>
+      </w:pPr>
+      <w:r>
+        <w:t>6.18 Analytics, GIS and exports (analytics_api.py)</w:t>
+      </w:r>
+    </w:p>
+    <w:p>
+      <w:pPr>
+        <w:pStyle w:val="ListBullet"/>
+        <w:spacing w:after="40"/>
+      </w:pPr>
+      <w:r>
+        <w:t>The same indicators are computed for State, District, Block, Village and Zone, with drill-down, ranking of the worst served, response times (report to incident, assigned to repaired), overdue tasks, water-quality status and a 14-day trend. Nobody sees a village they are not responsible for, whatever level they ask for.</w:t>
+      </w:r>
+    </w:p>
+    <w:p>
+      <w:pPr>
+        <w:pStyle w:val="ListBullet"/>
+        <w:spacing w:after="40"/>
+      </w:pPr>
+      <w:r>
+        <w:t>GIS: GET /geo/villages.geojson (GeoJSON points with indicators); a village map on the Analytics page. Village positions are fictional.</w:t>
+      </w:r>
+    </w:p>
+    <w:p>
+      <w:pPr>
+        <w:pStyle w:val="ListBullet"/>
+        <w:spacing w:after="40"/>
+      </w:pPr>
+      <w:r>
+        <w:t>Open data: CSV exports of taps, alerts, reports, water quality and tasks, anonymised and guarded against spreadsheet formula injection. Officers can read the audit log and a system status page.</w:t>
+      </w:r>
+    </w:p>
+    <w:p>
+      <w:pPr>
+        <w:pStyle w:val="Heading2"/>
+      </w:pPr>
+      <w:r>
+        <w:t>6.19 Security, scalability and deployment</w:t>
+      </w:r>
+    </w:p>
+    <w:p>
+      <w:pPr>
+        <w:pStyle w:val="ListBullet"/>
+        <w:spacing w:after="40"/>
+      </w:pPr>
+      <w:r>
+        <w:t>Built and tested: security headers on every response, no-store caching of signed-in data, a per-client rate limit (sensor ingestion gets four times as much), a request-size limit, a production start-up guard that refuses demo settings, automatic deletion of old readings (30 days by default), and a PostgreSQL connection pool.</w:t>
+      </w:r>
+    </w:p>
+    <w:p>
+      <w:pPr>
+        <w:pStyle w:val="ListBullet"/>
+        <w:spacing w:after="40"/>
+      </w:pPr>
+      <w:r>
+        <w:t>Written but not run (no Docker or PostgreSQL was available): Dockerfiles, docker-compose.yml, .env.example, an idempotent database initialiser (app.init_db, which is tested) and docs/DEPLOYMENT.md.</w:t>
+      </w:r>
+    </w:p>
+    <w:p>
+      <w:pPr>
+        <w:pStyle w:val="ListBullet"/>
+        <w:spacing w:after="40"/>
+      </w:pPr>
+      <w:r>
+        <w:t>Not built: migrations (Alembic), a message queue for ingestion, a shared rate limiter for several servers, background workers for the models, a load test, CI, user-management screens, a tool for loading real villages, and a security or privacy audit.</w:t>
+      </w:r>
+    </w:p>
+    <w:p>
+      <w:pPr>
         <w:pStyle w:val="Heading1"/>
       </w:pPr>
       <w:r>
@@ -5325,7 +5621,187 @@
               <w:rPr>
                 <w:sz w:val="19"/>
               </w:rPr>
-              <w:t>GET predictions · GET fhtc</w:t>
+              <w:t>GET predictions · GET fhtc · GET households · GET households/{id} · GET households/mine (villager)</w:t>
+            </w:r>
+          </w:p>
+        </w:tc>
+      </w:tr>
+      <w:tr>
+        <w:tc>
+          <w:tcPr>
+            <w:tcW w:type="dxa" w:w="1701"/>
+          </w:tcPr>
+          <w:p>
+            <w:r/>
+            <w:r>
+              <w:rPr>
+                <w:sz w:val="19"/>
+              </w:rPr>
+              <w:t>Villager feedback</w:t>
+            </w:r>
+          </w:p>
+        </w:tc>
+        <w:tc>
+          <w:tcPr>
+            <w:tcW w:type="dxa" w:w="7370"/>
+          </w:tcPr>
+          <w:p>
+            <w:r/>
+            <w:r>
+              <w:rPr>
+                <w:sz w:val="19"/>
+              </w:rPr>
+              <w:t>POST service-checks · GET service-checks/mine · POST complaints (with optional geo-tag)</w:t>
+            </w:r>
+          </w:p>
+        </w:tc>
+      </w:tr>
+      <w:tr>
+        <w:tc>
+          <w:tcPr>
+            <w:tcW w:type="dxa" w:w="1701"/>
+          </w:tcPr>
+          <w:p>
+            <w:r/>
+            <w:r>
+              <w:rPr>
+                <w:sz w:val="19"/>
+              </w:rPr>
+              <w:t>Water quality</w:t>
+            </w:r>
+          </w:p>
+        </w:tc>
+        <w:tc>
+          <w:tcPr>
+            <w:tcW w:type="dxa" w:w="7370"/>
+          </w:tcPr>
+          <w:p>
+            <w:r/>
+            <w:r>
+              <w:rPr>
+                <w:sz w:val="19"/>
+              </w:rPr>
+              <w:t>GET water-quality · POST water-quality/tests (GP) · GET water-quality/summary</w:t>
+            </w:r>
+          </w:p>
+        </w:tc>
+      </w:tr>
+      <w:tr>
+        <w:tc>
+          <w:tcPr>
+            <w:tcW w:type="dxa" w:w="1701"/>
+          </w:tcPr>
+          <w:p>
+            <w:r/>
+            <w:r>
+              <w:rPr>
+                <w:sz w:val="19"/>
+              </w:rPr>
+              <w:t>Alert Center</w:t>
+            </w:r>
+          </w:p>
+        </w:tc>
+        <w:tc>
+          <w:tcPr>
+            <w:tcW w:type="dxa" w:w="7370"/>
+          </w:tcPr>
+          <w:p>
+            <w:r/>
+            <w:r>
+              <w:rPr>
+                <w:sz w:val="19"/>
+              </w:rPr>
+              <w:t>GET alerts/feed · POST alerts/{id}/acknowledge</w:t>
+            </w:r>
+          </w:p>
+        </w:tc>
+      </w:tr>
+      <w:tr>
+        <w:tc>
+          <w:tcPr>
+            <w:tcW w:type="dxa" w:w="1701"/>
+          </w:tcPr>
+          <w:p>
+            <w:r/>
+            <w:r>
+              <w:rPr>
+                <w:sz w:val="19"/>
+              </w:rPr>
+              <w:t>Maintenance planner</w:t>
+            </w:r>
+          </w:p>
+        </w:tc>
+        <w:tc>
+          <w:tcPr>
+            <w:tcW w:type="dxa" w:w="7370"/>
+          </w:tcPr>
+          <w:p>
+            <w:r/>
+            <w:r>
+              <w:rPr>
+                <w:sz w:val="19"/>
+              </w:rPr>
+              <w:t>GET maintenance/priorities · POST maintenance/preventive (GP)</w:t>
+            </w:r>
+          </w:p>
+        </w:tc>
+      </w:tr>
+      <w:tr>
+        <w:tc>
+          <w:tcPr>
+            <w:tcW w:type="dxa" w:w="1701"/>
+          </w:tcPr>
+          <w:p>
+            <w:r/>
+            <w:r>
+              <w:rPr>
+                <w:sz w:val="19"/>
+              </w:rPr>
+              <w:t>Analytics and open data</w:t>
+            </w:r>
+          </w:p>
+        </w:tc>
+        <w:tc>
+          <w:tcPr>
+            <w:tcW w:type="dxa" w:w="7370"/>
+          </w:tcPr>
+          <w:p>
+            <w:r/>
+            <w:r>
+              <w:rPr>
+                <w:sz w:val="19"/>
+              </w:rPr>
+              <w:t>GET analytics/summary · GET analytics/hierarchy · GET geo/villages.geojson · GET export/{taps|alerts|complaints|water-quality|tasks}.csv</w:t>
+            </w:r>
+          </w:p>
+        </w:tc>
+      </w:tr>
+      <w:tr>
+        <w:tc>
+          <w:tcPr>
+            <w:tcW w:type="dxa" w:w="1701"/>
+          </w:tcPr>
+          <w:p>
+            <w:r/>
+            <w:r>
+              <w:rPr>
+                <w:sz w:val="19"/>
+              </w:rPr>
+              <w:t>Audit and system</w:t>
+            </w:r>
+          </w:p>
+        </w:tc>
+        <w:tc>
+          <w:tcPr>
+            <w:tcW w:type="dxa" w:w="7370"/>
+          </w:tcPr>
+          <w:p>
+            <w:r/>
+            <w:r>
+              <w:rPr>
+                <w:sz w:val="19"/>
+              </w:rPr>
+              <w:t>GET audit (officer) · GET system (officer)</w:t>
             </w:r>
           </w:p>
         </w:tc>
@@ -5949,7 +6425,7 @@
                 <w:rFonts w:ascii="Consolas" w:hAnsi="Consolas"/>
                 <w:sz w:val="18"/>
               </w:rPr>
-              <w:t>.\.venv\Scripts\python.exe -m pytest          # 143 tests should pass</w:t>
+              <w:t>.\.venv\Scripts\python.exe -m pytest          # 257 tests should pass</w:t>
             </w:r>
           </w:p>
           <w:p>
@@ -7212,6 +7688,42 @@
         <w:spacing w:after="40"/>
       </w:pPr>
       <w:r>
+        <w:t>Household status is an estimate plus the villager's own daily check: there are no household tap sensors or meters.</w:t>
+      </w:r>
+    </w:p>
+    <w:p>
+      <w:pPr>
+        <w:pStyle w:val="ListBullet"/>
+        <w:spacing w:after="40"/>
+      </w:pPr>
+      <w:r>
+        <w:t>Alerts reach people only inside the app: SMS, WhatsApp and voice-call delivery are not connected, and there is no native mobile app, offline queue or voice-note reporting.</w:t>
+      </w:r>
+    </w:p>
+    <w:p>
+      <w:pPr>
+        <w:pStyle w:val="ListBullet"/>
+        <w:spacing w:after="40"/>
+      </w:pPr>
+      <w:r>
+        <w:t>Docker, Docker Compose and PostgreSQL support were written but never run. There are no database migrations, no load test and no CI pipeline.</w:t>
+      </w:r>
+    </w:p>
+    <w:p>
+      <w:pPr>
+        <w:pStyle w:val="ListBullet"/>
+        <w:spacing w:after="40"/>
+      </w:pPr>
+      <w:r>
+        <w:t>The hierarchy has three villages in two blocks and two districts, so State and District views are small, and there is no separate State login (State views are in the officer role).</w:t>
+      </w:r>
+    </w:p>
+    <w:p>
+      <w:pPr>
+        <w:pStyle w:val="ListBullet"/>
+        <w:spacing w:after="40"/>
+      </w:pPr>
+      <w:r>
         <w:t>The national-platform connectors are mock: the message format is illustrative, and no real system is contacted.</w:t>
       </w:r>
     </w:p>
@@ -8666,7 +9178,7 @@
               <w:rPr>
                 <w:sz w:val="19"/>
               </w:rPr>
-              <w:t>AI engine, tap-connection monitor and their endpoints</w:t>
+              <w:t>AI engine, tap-connection and household monitor and their endpoints</w:t>
             </w:r>
           </w:p>
         </w:tc>
@@ -8682,7 +9194,7 @@
               <w:rPr>
                 <w:sz w:val="19"/>
               </w:rPr>
-              <w:t>backend/app/integrations.py</w:t>
+              <w:t>backend/app/households_api.py, quality.py, quality_api.py</w:t>
             </w:r>
           </w:p>
         </w:tc>
@@ -8696,7 +9208,7 @@
               <w:rPr>
                 <w:sz w:val="19"/>
               </w:rPr>
-              <w:t>Mock national-platform connectors, ID crosswalk, message log</w:t>
+              <w:t>Household taps, villager service checks, field-test water quality and advisories</w:t>
             </w:r>
           </w:p>
         </w:tc>
@@ -8712,7 +9224,7 @@
               <w:rPr>
                 <w:sz w:val="19"/>
               </w:rPr>
-              <w:t>backend/app/models.py, read_model.py, seed_loader.py</w:t>
+              <w:t>backend/app/ai_alerts.py, alerts_api.py</w:t>
             </w:r>
           </w:p>
         </w:tc>
@@ -8726,7 +9238,7 @@
               <w:rPr>
                 <w:sz w:val="19"/>
               </w:rPr>
-              <w:t>Tables, API response shapes, demo data loading</w:t>
+              <w:t>AI, quality and community alerts; the Alert Center feed, acknowledgement and escalation</w:t>
             </w:r>
           </w:p>
         </w:tc>
@@ -8742,6 +9254,186 @@
               <w:rPr>
                 <w:sz w:val="19"/>
               </w:rPr>
+              <w:t>backend/app/maintenance_api.py</w:t>
+            </w:r>
+          </w:p>
+        </w:tc>
+        <w:tc>
+          <w:tcPr>
+            <w:tcW w:type="dxa" w:w="5329"/>
+          </w:tcPr>
+          <w:p>
+            <w:r/>
+            <w:r>
+              <w:rPr>
+                <w:sz w:val="19"/>
+              </w:rPr>
+              <w:t>Preventive maintenance planner</w:t>
+            </w:r>
+          </w:p>
+        </w:tc>
+      </w:tr>
+      <w:tr>
+        <w:tc>
+          <w:tcPr>
+            <w:tcW w:type="dxa" w:w="3742"/>
+          </w:tcPr>
+          <w:p>
+            <w:r/>
+            <w:r>
+              <w:rPr>
+                <w:sz w:val="19"/>
+              </w:rPr>
+              <w:t>backend/app/analytics_api.py</w:t>
+            </w:r>
+          </w:p>
+        </w:tc>
+        <w:tc>
+          <w:tcPr>
+            <w:tcW w:type="dxa" w:w="5329"/>
+          </w:tcPr>
+          <w:p>
+            <w:r/>
+            <w:r>
+              <w:rPr>
+                <w:sz w:val="19"/>
+              </w:rPr>
+              <w:t>Multi-level analytics, GeoJSON, CSV exports, audit and system status</w:t>
+            </w:r>
+          </w:p>
+        </w:tc>
+      </w:tr>
+      <w:tr>
+        <w:tc>
+          <w:tcPr>
+            <w:tcW w:type="dxa" w:w="3742"/>
+          </w:tcPr>
+          <w:p>
+            <w:r/>
+            <w:r>
+              <w:rPr>
+                <w:sz w:val="19"/>
+              </w:rPr>
+              <w:t>backend/app/security.py, retention.py, init_db.py</w:t>
+            </w:r>
+          </w:p>
+        </w:tc>
+        <w:tc>
+          <w:tcPr>
+            <w:tcW w:type="dxa" w:w="5329"/>
+          </w:tcPr>
+          <w:p>
+            <w:r/>
+            <w:r>
+              <w:rPr>
+                <w:sz w:val="19"/>
+              </w:rPr>
+              <w:t>Safeguards, reading retention, safe database initialiser</w:t>
+            </w:r>
+          </w:p>
+        </w:tc>
+      </w:tr>
+      <w:tr>
+        <w:tc>
+          <w:tcPr>
+            <w:tcW w:type="dxa" w:w="3742"/>
+          </w:tcPr>
+          <w:p>
+            <w:r/>
+            <w:r>
+              <w:rPr>
+                <w:sz w:val="19"/>
+              </w:rPr>
+              <w:t>docs/Requirements_Coverage.md, DEPLOYMENT.md, openapi.json</w:t>
+            </w:r>
+          </w:p>
+        </w:tc>
+        <w:tc>
+          <w:tcPr>
+            <w:tcW w:type="dxa" w:w="5329"/>
+          </w:tcPr>
+          <w:p>
+            <w:r/>
+            <w:r>
+              <w:rPr>
+                <w:sz w:val="19"/>
+              </w:rPr>
+              <w:t>Problem-statement coverage review, deployment guide, API description</w:t>
+            </w:r>
+          </w:p>
+        </w:tc>
+      </w:tr>
+      <w:tr>
+        <w:tc>
+          <w:tcPr>
+            <w:tcW w:type="dxa" w:w="3742"/>
+          </w:tcPr>
+          <w:p>
+            <w:r/>
+            <w:r>
+              <w:rPr>
+                <w:sz w:val="19"/>
+              </w:rPr>
+              <w:t>backend/app/integrations.py</w:t>
+            </w:r>
+          </w:p>
+        </w:tc>
+        <w:tc>
+          <w:tcPr>
+            <w:tcW w:type="dxa" w:w="5329"/>
+          </w:tcPr>
+          <w:p>
+            <w:r/>
+            <w:r>
+              <w:rPr>
+                <w:sz w:val="19"/>
+              </w:rPr>
+              <w:t>Mock national-platform connectors, ID crosswalk, message log</w:t>
+            </w:r>
+          </w:p>
+        </w:tc>
+      </w:tr>
+      <w:tr>
+        <w:tc>
+          <w:tcPr>
+            <w:tcW w:type="dxa" w:w="3742"/>
+          </w:tcPr>
+          <w:p>
+            <w:r/>
+            <w:r>
+              <w:rPr>
+                <w:sz w:val="19"/>
+              </w:rPr>
+              <w:t>backend/app/models.py, read_model.py, seed_loader.py</w:t>
+            </w:r>
+          </w:p>
+        </w:tc>
+        <w:tc>
+          <w:tcPr>
+            <w:tcW w:type="dxa" w:w="5329"/>
+          </w:tcPr>
+          <w:p>
+            <w:r/>
+            <w:r>
+              <w:rPr>
+                <w:sz w:val="19"/>
+              </w:rPr>
+              <w:t>Tables, API response shapes, demo data loading</w:t>
+            </w:r>
+          </w:p>
+        </w:tc>
+      </w:tr>
+      <w:tr>
+        <w:tc>
+          <w:tcPr>
+            <w:tcW w:type="dxa" w:w="3742"/>
+          </w:tcPr>
+          <w:p>
+            <w:r/>
+            <w:r>
+              <w:rPr>
+                <w:sz w:val="19"/>
+              </w:rPr>
               <w:t>backend/tests/</w:t>
             </w:r>
           </w:p>
@@ -8756,7 +9448,7 @@
               <w:rPr>
                 <w:sz w:val="19"/>
               </w:rPr>
-              <w:t>143 pytest tests</w:t>
+              <w:t>257 pytest tests</w:t>
             </w:r>
           </w:p>
         </w:tc>

</xml_diff>